<commit_message>
renamed:    yolov8/ultralytics-main/program/labelimg_base/pbc_improve/PBC labelling.v1i.yolov8.zip -> runs/detect/predict-4/sample.avi 	modified:   "undergraduate_thesis/\345\220\264\345\230\211\350\261\252-\346\257\225\350\256\276\350\256\272\346\226\207ans-V3.docx" 	modified:   "undergraduate_thesis/\345\220\264\345\230\211\350\261\252-\346\257\225\350\256\276\350\256\272\346\226\207ans-V3.pdf" 	deleted:    yolov8/ultralytics-main/program/labelimg_base/pbc_improve/README.dataset.txt 	deleted:    yolov8/ultralytics-main/program/labelimg_base/pbc_improve/README.roboflow.txt 	deleted:    yolov8/ultralytics-main/program/labelimg_base/pbc_rec/PBC labelling.v1i.yolov8.zip 	deleted:    yolov8/ultralytics-main/program/labelimg_base/pbc_rec/README.dataset.txt 	deleted:    yolov8/ultralytics-main/program/labelimg_base/pbc_rec/README.roboflow.txt 	modified:   yolov8/yolov8_basic_code
</commit_message>
<xml_diff>
--- a/undergraduate_thesis/吴嘉豪-毕设论文ans-V3.docx
+++ b/undergraduate_thesis/吴嘉豪-毕设论文ans-V3.docx
@@ -1564,7 +1564,19 @@
         <w:rPr>
           <w:rFonts w:hint="eastAsia"/>
         </w:rPr>
-        <w:t>PBC labeling</w:t>
+        <w:t>PBC label</w:t>
+      </w:r>
+      <w:r>
+        <w:rPr>
+          <w:rFonts w:hint="eastAsia"/>
+        </w:rPr>
+        <w:t>l</w:t>
+      </w:r>
+      <w:r>
+        <w:rPr>
+          <w:rFonts w:hint="eastAsia"/>
+        </w:rPr>
+        <w:t>ing</w:t>
       </w:r>
       <w:r>
         <w:rPr>
@@ -1967,7 +1979,16 @@
         <w:pStyle w:val="aff6"/>
       </w:pPr>
       <w:r>
-        <w:t xml:space="preserve">Based on the public dataset PBC labeling, erythrocytes are supplemented and data cleaning is performed to build an enhanced dataset named PBC labeling Extended. Using YOLOv8n as the baseline model, a two‑stage class‑incremental learning strategy is adopted: in the first stage, an 8‑class target cell detection model is trained (mAP50=0.941); in the second stage, the backbone network is frozen and a down‑sampling strategy (at most </w:t>
+        <w:t>Based on the public dataset PBC label</w:t>
+      </w:r>
+      <w:r>
+        <w:rPr>
+          <w:rFonts w:hint="eastAsia"/>
+        </w:rPr>
+        <w:t>l</w:t>
+      </w:r>
+      <w:r>
+        <w:t xml:space="preserve">ing, erythrocytes are supplemented and data cleaning is performed to build an enhanced dataset named PBC labeling Extended. Using YOLOv8n as the baseline model, a two‑stage class‑incremental learning strategy is adopted: in the first stage, an 8‑class target cell detection model is trained (mAP50=0.941); in the second stage, the backbone network is frozen and a down‑sampling strategy (at most </w:t>
       </w:r>
       <w:r>
         <w:rPr>
@@ -2110,7 +2131,7 @@
       <w:pPr>
         <w:pStyle w:val="TOC1"/>
         <w:rPr>
-          <w:rFonts w:asciiTheme="minorHAnsi" w:eastAsiaTheme="minorEastAsia" w:hAnsiTheme="minorHAnsi" w:cstheme="minorBidi" w:hint="eastAsia"/>
+          <w:rFonts w:asciiTheme="minorHAnsi" w:eastAsiaTheme="minorEastAsia" w:hAnsiTheme="minorHAnsi" w:cstheme="minorBidi"/>
           <w:bCs w:val="0"/>
           <w:caps w:val="0"/>
           <w:noProof/>
@@ -2244,7 +2265,7 @@
       <w:pPr>
         <w:pStyle w:val="TOC1"/>
         <w:rPr>
-          <w:rFonts w:asciiTheme="minorHAnsi" w:eastAsiaTheme="minorEastAsia" w:hAnsiTheme="minorHAnsi" w:cstheme="minorBidi" w:hint="eastAsia"/>
+          <w:rFonts w:asciiTheme="minorHAnsi" w:eastAsiaTheme="minorEastAsia" w:hAnsiTheme="minorHAnsi" w:cstheme="minorBidi"/>
           <w:bCs w:val="0"/>
           <w:caps w:val="0"/>
           <w:noProof/>
@@ -2337,7 +2358,7 @@
       <w:pPr>
         <w:pStyle w:val="TOC1"/>
         <w:rPr>
-          <w:rFonts w:asciiTheme="minorHAnsi" w:eastAsiaTheme="minorEastAsia" w:hAnsiTheme="minorHAnsi" w:cstheme="minorBidi" w:hint="eastAsia"/>
+          <w:rFonts w:asciiTheme="minorHAnsi" w:eastAsiaTheme="minorEastAsia" w:hAnsiTheme="minorHAnsi" w:cstheme="minorBidi"/>
           <w:bCs w:val="0"/>
           <w:caps w:val="0"/>
           <w:noProof/>
@@ -2446,7 +2467,7 @@
       <w:pPr>
         <w:pStyle w:val="TOC1"/>
         <w:rPr>
-          <w:rFonts w:asciiTheme="minorHAnsi" w:eastAsiaTheme="minorEastAsia" w:hAnsiTheme="minorHAnsi" w:cstheme="minorBidi" w:hint="eastAsia"/>
+          <w:rFonts w:asciiTheme="minorHAnsi" w:eastAsiaTheme="minorEastAsia" w:hAnsiTheme="minorHAnsi" w:cstheme="minorBidi"/>
           <w:bCs w:val="0"/>
           <w:caps w:val="0"/>
           <w:noProof/>
@@ -2566,7 +2587,7 @@
       <w:pPr>
         <w:pStyle w:val="TOC2"/>
         <w:rPr>
-          <w:rFonts w:asciiTheme="minorHAnsi" w:eastAsiaTheme="minorEastAsia" w:hAnsiTheme="minorHAnsi" w:cstheme="minorBidi" w:hint="eastAsia"/>
+          <w:rFonts w:asciiTheme="minorHAnsi" w:eastAsiaTheme="minorEastAsia" w:hAnsiTheme="minorHAnsi" w:cstheme="minorBidi"/>
           <w:smallCaps w:val="0"/>
           <w:noProof/>
           <w:sz w:val="22"/>
@@ -2663,7 +2684,7 @@
       <w:pPr>
         <w:pStyle w:val="TOC2"/>
         <w:rPr>
-          <w:rFonts w:asciiTheme="minorHAnsi" w:eastAsiaTheme="minorEastAsia" w:hAnsiTheme="minorHAnsi" w:cstheme="minorBidi" w:hint="eastAsia"/>
+          <w:rFonts w:asciiTheme="minorHAnsi" w:eastAsiaTheme="minorEastAsia" w:hAnsiTheme="minorHAnsi" w:cstheme="minorBidi"/>
           <w:smallCaps w:val="0"/>
           <w:noProof/>
           <w:sz w:val="22"/>
@@ -2760,7 +2781,7 @@
       <w:pPr>
         <w:pStyle w:val="TOC2"/>
         <w:rPr>
-          <w:rFonts w:asciiTheme="minorHAnsi" w:eastAsiaTheme="minorEastAsia" w:hAnsiTheme="minorHAnsi" w:cstheme="minorBidi" w:hint="eastAsia"/>
+          <w:rFonts w:asciiTheme="minorHAnsi" w:eastAsiaTheme="minorEastAsia" w:hAnsiTheme="minorHAnsi" w:cstheme="minorBidi"/>
           <w:smallCaps w:val="0"/>
           <w:noProof/>
           <w:sz w:val="22"/>
@@ -2857,7 +2878,7 @@
       <w:pPr>
         <w:pStyle w:val="TOC3"/>
         <w:rPr>
-          <w:rFonts w:asciiTheme="minorHAnsi" w:eastAsiaTheme="minorEastAsia" w:hAnsiTheme="minorHAnsi" w:cstheme="minorBidi" w:hint="eastAsia"/>
+          <w:rFonts w:asciiTheme="minorHAnsi" w:eastAsiaTheme="minorEastAsia" w:hAnsiTheme="minorHAnsi" w:cstheme="minorBidi"/>
           <w:bCs w:val="0"/>
           <w:iCs w:val="0"/>
           <w:sz w:val="22"/>
@@ -2944,7 +2965,7 @@
       <w:pPr>
         <w:pStyle w:val="TOC3"/>
         <w:rPr>
-          <w:rFonts w:asciiTheme="minorHAnsi" w:eastAsiaTheme="minorEastAsia" w:hAnsiTheme="minorHAnsi" w:cstheme="minorBidi" w:hint="eastAsia"/>
+          <w:rFonts w:asciiTheme="minorHAnsi" w:eastAsiaTheme="minorEastAsia" w:hAnsiTheme="minorHAnsi" w:cstheme="minorBidi"/>
           <w:bCs w:val="0"/>
           <w:iCs w:val="0"/>
           <w:sz w:val="22"/>
@@ -3031,7 +3052,7 @@
       <w:pPr>
         <w:pStyle w:val="TOC3"/>
         <w:rPr>
-          <w:rFonts w:asciiTheme="minorHAnsi" w:eastAsiaTheme="minorEastAsia" w:hAnsiTheme="minorHAnsi" w:cstheme="minorBidi" w:hint="eastAsia"/>
+          <w:rFonts w:asciiTheme="minorHAnsi" w:eastAsiaTheme="minorEastAsia" w:hAnsiTheme="minorHAnsi" w:cstheme="minorBidi"/>
           <w:bCs w:val="0"/>
           <w:iCs w:val="0"/>
           <w:sz w:val="22"/>
@@ -3118,7 +3139,7 @@
       <w:pPr>
         <w:pStyle w:val="TOC1"/>
         <w:rPr>
-          <w:rFonts w:asciiTheme="minorHAnsi" w:eastAsiaTheme="minorEastAsia" w:hAnsiTheme="minorHAnsi" w:cstheme="minorBidi" w:hint="eastAsia"/>
+          <w:rFonts w:asciiTheme="minorHAnsi" w:eastAsiaTheme="minorEastAsia" w:hAnsiTheme="minorHAnsi" w:cstheme="minorBidi"/>
           <w:bCs w:val="0"/>
           <w:caps w:val="0"/>
           <w:noProof/>
@@ -3238,7 +3259,7 @@
       <w:pPr>
         <w:pStyle w:val="TOC2"/>
         <w:rPr>
-          <w:rFonts w:asciiTheme="minorHAnsi" w:eastAsiaTheme="minorEastAsia" w:hAnsiTheme="minorHAnsi" w:cstheme="minorBidi" w:hint="eastAsia"/>
+          <w:rFonts w:asciiTheme="minorHAnsi" w:eastAsiaTheme="minorEastAsia" w:hAnsiTheme="minorHAnsi" w:cstheme="minorBidi"/>
           <w:smallCaps w:val="0"/>
           <w:noProof/>
           <w:sz w:val="22"/>
@@ -3349,7 +3370,7 @@
       <w:pPr>
         <w:pStyle w:val="TOC3"/>
         <w:rPr>
-          <w:rFonts w:asciiTheme="minorHAnsi" w:eastAsiaTheme="minorEastAsia" w:hAnsiTheme="minorHAnsi" w:cstheme="minorBidi" w:hint="eastAsia"/>
+          <w:rFonts w:asciiTheme="minorHAnsi" w:eastAsiaTheme="minorEastAsia" w:hAnsiTheme="minorHAnsi" w:cstheme="minorBidi"/>
           <w:bCs w:val="0"/>
           <w:iCs w:val="0"/>
           <w:sz w:val="22"/>
@@ -3436,7 +3457,7 @@
       <w:pPr>
         <w:pStyle w:val="TOC3"/>
         <w:rPr>
-          <w:rFonts w:asciiTheme="minorHAnsi" w:eastAsiaTheme="minorEastAsia" w:hAnsiTheme="minorHAnsi" w:cstheme="minorBidi" w:hint="eastAsia"/>
+          <w:rFonts w:asciiTheme="minorHAnsi" w:eastAsiaTheme="minorEastAsia" w:hAnsiTheme="minorHAnsi" w:cstheme="minorBidi"/>
           <w:bCs w:val="0"/>
           <w:iCs w:val="0"/>
           <w:sz w:val="22"/>
@@ -3523,7 +3544,7 @@
       <w:pPr>
         <w:pStyle w:val="TOC3"/>
         <w:rPr>
-          <w:rFonts w:asciiTheme="minorHAnsi" w:eastAsiaTheme="minorEastAsia" w:hAnsiTheme="minorHAnsi" w:cstheme="minorBidi" w:hint="eastAsia"/>
+          <w:rFonts w:asciiTheme="minorHAnsi" w:eastAsiaTheme="minorEastAsia" w:hAnsiTheme="minorHAnsi" w:cstheme="minorBidi"/>
           <w:bCs w:val="0"/>
           <w:iCs w:val="0"/>
           <w:sz w:val="22"/>
@@ -3610,7 +3631,7 @@
       <w:pPr>
         <w:pStyle w:val="TOC2"/>
         <w:rPr>
-          <w:rFonts w:asciiTheme="minorHAnsi" w:eastAsiaTheme="minorEastAsia" w:hAnsiTheme="minorHAnsi" w:cstheme="minorBidi" w:hint="eastAsia"/>
+          <w:rFonts w:asciiTheme="minorHAnsi" w:eastAsiaTheme="minorEastAsia" w:hAnsiTheme="minorHAnsi" w:cstheme="minorBidi"/>
           <w:smallCaps w:val="0"/>
           <w:noProof/>
           <w:sz w:val="22"/>
@@ -3707,7 +3728,7 @@
       <w:pPr>
         <w:pStyle w:val="TOC3"/>
         <w:rPr>
-          <w:rFonts w:asciiTheme="minorHAnsi" w:eastAsiaTheme="minorEastAsia" w:hAnsiTheme="minorHAnsi" w:cstheme="minorBidi" w:hint="eastAsia"/>
+          <w:rFonts w:asciiTheme="minorHAnsi" w:eastAsiaTheme="minorEastAsia" w:hAnsiTheme="minorHAnsi" w:cstheme="minorBidi"/>
           <w:bCs w:val="0"/>
           <w:iCs w:val="0"/>
           <w:sz w:val="22"/>
@@ -3794,7 +3815,7 @@
       <w:pPr>
         <w:pStyle w:val="TOC3"/>
         <w:rPr>
-          <w:rFonts w:asciiTheme="minorHAnsi" w:eastAsiaTheme="minorEastAsia" w:hAnsiTheme="minorHAnsi" w:cstheme="minorBidi" w:hint="eastAsia"/>
+          <w:rFonts w:asciiTheme="minorHAnsi" w:eastAsiaTheme="minorEastAsia" w:hAnsiTheme="minorHAnsi" w:cstheme="minorBidi"/>
           <w:bCs w:val="0"/>
           <w:iCs w:val="0"/>
           <w:sz w:val="22"/>
@@ -3881,7 +3902,7 @@
       <w:pPr>
         <w:pStyle w:val="TOC2"/>
         <w:rPr>
-          <w:rFonts w:asciiTheme="minorHAnsi" w:eastAsiaTheme="minorEastAsia" w:hAnsiTheme="minorHAnsi" w:cstheme="minorBidi" w:hint="eastAsia"/>
+          <w:rFonts w:asciiTheme="minorHAnsi" w:eastAsiaTheme="minorEastAsia" w:hAnsiTheme="minorHAnsi" w:cstheme="minorBidi"/>
           <w:smallCaps w:val="0"/>
           <w:noProof/>
           <w:sz w:val="22"/>
@@ -3978,7 +3999,7 @@
       <w:pPr>
         <w:pStyle w:val="TOC3"/>
         <w:rPr>
-          <w:rFonts w:asciiTheme="minorHAnsi" w:eastAsiaTheme="minorEastAsia" w:hAnsiTheme="minorHAnsi" w:cstheme="minorBidi" w:hint="eastAsia"/>
+          <w:rFonts w:asciiTheme="minorHAnsi" w:eastAsiaTheme="minorEastAsia" w:hAnsiTheme="minorHAnsi" w:cstheme="minorBidi"/>
           <w:bCs w:val="0"/>
           <w:iCs w:val="0"/>
           <w:sz w:val="22"/>
@@ -4065,7 +4086,7 @@
       <w:pPr>
         <w:pStyle w:val="TOC3"/>
         <w:rPr>
-          <w:rFonts w:asciiTheme="minorHAnsi" w:eastAsiaTheme="minorEastAsia" w:hAnsiTheme="minorHAnsi" w:cstheme="minorBidi" w:hint="eastAsia"/>
+          <w:rFonts w:asciiTheme="minorHAnsi" w:eastAsiaTheme="minorEastAsia" w:hAnsiTheme="minorHAnsi" w:cstheme="minorBidi"/>
           <w:bCs w:val="0"/>
           <w:iCs w:val="0"/>
           <w:sz w:val="22"/>
@@ -4152,7 +4173,7 @@
       <w:pPr>
         <w:pStyle w:val="TOC3"/>
         <w:rPr>
-          <w:rFonts w:asciiTheme="minorHAnsi" w:eastAsiaTheme="minorEastAsia" w:hAnsiTheme="minorHAnsi" w:cstheme="minorBidi" w:hint="eastAsia"/>
+          <w:rFonts w:asciiTheme="minorHAnsi" w:eastAsiaTheme="minorEastAsia" w:hAnsiTheme="minorHAnsi" w:cstheme="minorBidi"/>
           <w:bCs w:val="0"/>
           <w:iCs w:val="0"/>
           <w:sz w:val="22"/>
@@ -4239,7 +4260,7 @@
       <w:pPr>
         <w:pStyle w:val="TOC2"/>
         <w:rPr>
-          <w:rFonts w:asciiTheme="minorHAnsi" w:eastAsiaTheme="minorEastAsia" w:hAnsiTheme="minorHAnsi" w:cstheme="minorBidi" w:hint="eastAsia"/>
+          <w:rFonts w:asciiTheme="minorHAnsi" w:eastAsiaTheme="minorEastAsia" w:hAnsiTheme="minorHAnsi" w:cstheme="minorBidi"/>
           <w:smallCaps w:val="0"/>
           <w:noProof/>
           <w:sz w:val="22"/>
@@ -4336,7 +4357,7 @@
       <w:pPr>
         <w:pStyle w:val="TOC3"/>
         <w:rPr>
-          <w:rFonts w:asciiTheme="minorHAnsi" w:eastAsiaTheme="minorEastAsia" w:hAnsiTheme="minorHAnsi" w:cstheme="minorBidi" w:hint="eastAsia"/>
+          <w:rFonts w:asciiTheme="minorHAnsi" w:eastAsiaTheme="minorEastAsia" w:hAnsiTheme="minorHAnsi" w:cstheme="minorBidi"/>
           <w:bCs w:val="0"/>
           <w:iCs w:val="0"/>
           <w:sz w:val="22"/>
@@ -4423,7 +4444,7 @@
       <w:pPr>
         <w:pStyle w:val="TOC3"/>
         <w:rPr>
-          <w:rFonts w:asciiTheme="minorHAnsi" w:eastAsiaTheme="minorEastAsia" w:hAnsiTheme="minorHAnsi" w:cstheme="minorBidi" w:hint="eastAsia"/>
+          <w:rFonts w:asciiTheme="minorHAnsi" w:eastAsiaTheme="minorEastAsia" w:hAnsiTheme="minorHAnsi" w:cstheme="minorBidi"/>
           <w:bCs w:val="0"/>
           <w:iCs w:val="0"/>
           <w:sz w:val="22"/>
@@ -4510,7 +4531,7 @@
       <w:pPr>
         <w:pStyle w:val="TOC2"/>
         <w:rPr>
-          <w:rFonts w:asciiTheme="minorHAnsi" w:eastAsiaTheme="minorEastAsia" w:hAnsiTheme="minorHAnsi" w:cstheme="minorBidi" w:hint="eastAsia"/>
+          <w:rFonts w:asciiTheme="minorHAnsi" w:eastAsiaTheme="minorEastAsia" w:hAnsiTheme="minorHAnsi" w:cstheme="minorBidi"/>
           <w:smallCaps w:val="0"/>
           <w:noProof/>
           <w:sz w:val="22"/>
@@ -4607,7 +4628,7 @@
       <w:pPr>
         <w:pStyle w:val="TOC1"/>
         <w:rPr>
-          <w:rFonts w:asciiTheme="minorHAnsi" w:eastAsiaTheme="minorEastAsia" w:hAnsiTheme="minorHAnsi" w:cstheme="minorBidi" w:hint="eastAsia"/>
+          <w:rFonts w:asciiTheme="minorHAnsi" w:eastAsiaTheme="minorEastAsia" w:hAnsiTheme="minorHAnsi" w:cstheme="minorBidi"/>
           <w:bCs w:val="0"/>
           <w:caps w:val="0"/>
           <w:noProof/>
@@ -4727,7 +4748,7 @@
       <w:pPr>
         <w:pStyle w:val="TOC2"/>
         <w:rPr>
-          <w:rFonts w:asciiTheme="minorHAnsi" w:eastAsiaTheme="minorEastAsia" w:hAnsiTheme="minorHAnsi" w:cstheme="minorBidi" w:hint="eastAsia"/>
+          <w:rFonts w:asciiTheme="minorHAnsi" w:eastAsiaTheme="minorEastAsia" w:hAnsiTheme="minorHAnsi" w:cstheme="minorBidi"/>
           <w:smallCaps w:val="0"/>
           <w:noProof/>
           <w:sz w:val="22"/>
@@ -4824,7 +4845,7 @@
       <w:pPr>
         <w:pStyle w:val="TOC2"/>
         <w:rPr>
-          <w:rFonts w:asciiTheme="minorHAnsi" w:eastAsiaTheme="minorEastAsia" w:hAnsiTheme="minorHAnsi" w:cstheme="minorBidi" w:hint="eastAsia"/>
+          <w:rFonts w:asciiTheme="minorHAnsi" w:eastAsiaTheme="minorEastAsia" w:hAnsiTheme="minorHAnsi" w:cstheme="minorBidi"/>
           <w:smallCaps w:val="0"/>
           <w:noProof/>
           <w:sz w:val="22"/>
@@ -4921,7 +4942,7 @@
       <w:pPr>
         <w:pStyle w:val="TOC3"/>
         <w:rPr>
-          <w:rFonts w:asciiTheme="minorHAnsi" w:eastAsiaTheme="minorEastAsia" w:hAnsiTheme="minorHAnsi" w:cstheme="minorBidi" w:hint="eastAsia"/>
+          <w:rFonts w:asciiTheme="minorHAnsi" w:eastAsiaTheme="minorEastAsia" w:hAnsiTheme="minorHAnsi" w:cstheme="minorBidi"/>
           <w:bCs w:val="0"/>
           <w:iCs w:val="0"/>
           <w:sz w:val="22"/>
@@ -5008,7 +5029,7 @@
       <w:pPr>
         <w:pStyle w:val="TOC3"/>
         <w:rPr>
-          <w:rFonts w:asciiTheme="minorHAnsi" w:eastAsiaTheme="minorEastAsia" w:hAnsiTheme="minorHAnsi" w:cstheme="minorBidi" w:hint="eastAsia"/>
+          <w:rFonts w:asciiTheme="minorHAnsi" w:eastAsiaTheme="minorEastAsia" w:hAnsiTheme="minorHAnsi" w:cstheme="minorBidi"/>
           <w:bCs w:val="0"/>
           <w:iCs w:val="0"/>
           <w:sz w:val="22"/>
@@ -5095,7 +5116,7 @@
       <w:pPr>
         <w:pStyle w:val="TOC2"/>
         <w:rPr>
-          <w:rFonts w:asciiTheme="minorHAnsi" w:eastAsiaTheme="minorEastAsia" w:hAnsiTheme="minorHAnsi" w:cstheme="minorBidi" w:hint="eastAsia"/>
+          <w:rFonts w:asciiTheme="minorHAnsi" w:eastAsiaTheme="minorEastAsia" w:hAnsiTheme="minorHAnsi" w:cstheme="minorBidi"/>
           <w:smallCaps w:val="0"/>
           <w:noProof/>
           <w:sz w:val="22"/>
@@ -5192,7 +5213,7 @@
       <w:pPr>
         <w:pStyle w:val="TOC3"/>
         <w:rPr>
-          <w:rFonts w:asciiTheme="minorHAnsi" w:eastAsiaTheme="minorEastAsia" w:hAnsiTheme="minorHAnsi" w:cstheme="minorBidi" w:hint="eastAsia"/>
+          <w:rFonts w:asciiTheme="minorHAnsi" w:eastAsiaTheme="minorEastAsia" w:hAnsiTheme="minorHAnsi" w:cstheme="minorBidi"/>
           <w:bCs w:val="0"/>
           <w:iCs w:val="0"/>
           <w:sz w:val="22"/>
@@ -5291,7 +5312,7 @@
       <w:pPr>
         <w:pStyle w:val="TOC3"/>
         <w:rPr>
-          <w:rFonts w:asciiTheme="minorHAnsi" w:eastAsiaTheme="minorEastAsia" w:hAnsiTheme="minorHAnsi" w:cstheme="minorBidi" w:hint="eastAsia"/>
+          <w:rFonts w:asciiTheme="minorHAnsi" w:eastAsiaTheme="minorEastAsia" w:hAnsiTheme="minorHAnsi" w:cstheme="minorBidi"/>
           <w:bCs w:val="0"/>
           <w:iCs w:val="0"/>
           <w:sz w:val="22"/>
@@ -5378,7 +5399,7 @@
       <w:pPr>
         <w:pStyle w:val="TOC2"/>
         <w:rPr>
-          <w:rFonts w:asciiTheme="minorHAnsi" w:eastAsiaTheme="minorEastAsia" w:hAnsiTheme="minorHAnsi" w:cstheme="minorBidi" w:hint="eastAsia"/>
+          <w:rFonts w:asciiTheme="minorHAnsi" w:eastAsiaTheme="minorEastAsia" w:hAnsiTheme="minorHAnsi" w:cstheme="minorBidi"/>
           <w:smallCaps w:val="0"/>
           <w:noProof/>
           <w:sz w:val="22"/>
@@ -5475,7 +5496,7 @@
       <w:pPr>
         <w:pStyle w:val="TOC2"/>
         <w:rPr>
-          <w:rFonts w:asciiTheme="minorHAnsi" w:eastAsiaTheme="minorEastAsia" w:hAnsiTheme="minorHAnsi" w:cstheme="minorBidi" w:hint="eastAsia"/>
+          <w:rFonts w:asciiTheme="minorHAnsi" w:eastAsiaTheme="minorEastAsia" w:hAnsiTheme="minorHAnsi" w:cstheme="minorBidi"/>
           <w:smallCaps w:val="0"/>
           <w:noProof/>
           <w:sz w:val="22"/>
@@ -5572,7 +5593,7 @@
       <w:pPr>
         <w:pStyle w:val="TOC1"/>
         <w:rPr>
-          <w:rFonts w:asciiTheme="minorHAnsi" w:eastAsiaTheme="minorEastAsia" w:hAnsiTheme="minorHAnsi" w:cstheme="minorBidi" w:hint="eastAsia"/>
+          <w:rFonts w:asciiTheme="minorHAnsi" w:eastAsiaTheme="minorEastAsia" w:hAnsiTheme="minorHAnsi" w:cstheme="minorBidi"/>
           <w:bCs w:val="0"/>
           <w:caps w:val="0"/>
           <w:noProof/>
@@ -5706,7 +5727,7 @@
       <w:pPr>
         <w:pStyle w:val="TOC2"/>
         <w:rPr>
-          <w:rFonts w:asciiTheme="minorHAnsi" w:eastAsiaTheme="minorEastAsia" w:hAnsiTheme="minorHAnsi" w:cstheme="minorBidi" w:hint="eastAsia"/>
+          <w:rFonts w:asciiTheme="minorHAnsi" w:eastAsiaTheme="minorEastAsia" w:hAnsiTheme="minorHAnsi" w:cstheme="minorBidi"/>
           <w:smallCaps w:val="0"/>
           <w:noProof/>
           <w:sz w:val="22"/>
@@ -5803,7 +5824,7 @@
       <w:pPr>
         <w:pStyle w:val="TOC3"/>
         <w:rPr>
-          <w:rFonts w:asciiTheme="minorHAnsi" w:eastAsiaTheme="minorEastAsia" w:hAnsiTheme="minorHAnsi" w:cstheme="minorBidi" w:hint="eastAsia"/>
+          <w:rFonts w:asciiTheme="minorHAnsi" w:eastAsiaTheme="minorEastAsia" w:hAnsiTheme="minorHAnsi" w:cstheme="minorBidi"/>
           <w:bCs w:val="0"/>
           <w:iCs w:val="0"/>
           <w:sz w:val="22"/>
@@ -5890,7 +5911,7 @@
       <w:pPr>
         <w:pStyle w:val="TOC2"/>
         <w:rPr>
-          <w:rFonts w:asciiTheme="minorHAnsi" w:eastAsiaTheme="minorEastAsia" w:hAnsiTheme="minorHAnsi" w:cstheme="minorBidi" w:hint="eastAsia"/>
+          <w:rFonts w:asciiTheme="minorHAnsi" w:eastAsiaTheme="minorEastAsia" w:hAnsiTheme="minorHAnsi" w:cstheme="minorBidi"/>
           <w:smallCaps w:val="0"/>
           <w:noProof/>
           <w:sz w:val="22"/>
@@ -5987,7 +6008,7 @@
       <w:pPr>
         <w:pStyle w:val="TOC3"/>
         <w:rPr>
-          <w:rFonts w:asciiTheme="minorHAnsi" w:eastAsiaTheme="minorEastAsia" w:hAnsiTheme="minorHAnsi" w:cstheme="minorBidi" w:hint="eastAsia"/>
+          <w:rFonts w:asciiTheme="minorHAnsi" w:eastAsiaTheme="minorEastAsia" w:hAnsiTheme="minorHAnsi" w:cstheme="minorBidi"/>
           <w:bCs w:val="0"/>
           <w:iCs w:val="0"/>
           <w:sz w:val="22"/>
@@ -6074,7 +6095,7 @@
       <w:pPr>
         <w:pStyle w:val="TOC3"/>
         <w:rPr>
-          <w:rFonts w:asciiTheme="minorHAnsi" w:eastAsiaTheme="minorEastAsia" w:hAnsiTheme="minorHAnsi" w:cstheme="minorBidi" w:hint="eastAsia"/>
+          <w:rFonts w:asciiTheme="minorHAnsi" w:eastAsiaTheme="minorEastAsia" w:hAnsiTheme="minorHAnsi" w:cstheme="minorBidi"/>
           <w:bCs w:val="0"/>
           <w:iCs w:val="0"/>
           <w:sz w:val="22"/>
@@ -6161,7 +6182,7 @@
       <w:pPr>
         <w:pStyle w:val="TOC2"/>
         <w:rPr>
-          <w:rFonts w:asciiTheme="minorHAnsi" w:eastAsiaTheme="minorEastAsia" w:hAnsiTheme="minorHAnsi" w:cstheme="minorBidi" w:hint="eastAsia"/>
+          <w:rFonts w:asciiTheme="minorHAnsi" w:eastAsiaTheme="minorEastAsia" w:hAnsiTheme="minorHAnsi" w:cstheme="minorBidi"/>
           <w:smallCaps w:val="0"/>
           <w:noProof/>
           <w:sz w:val="22"/>
@@ -6258,7 +6279,7 @@
       <w:pPr>
         <w:pStyle w:val="TOC3"/>
         <w:rPr>
-          <w:rFonts w:asciiTheme="minorHAnsi" w:eastAsiaTheme="minorEastAsia" w:hAnsiTheme="minorHAnsi" w:cstheme="minorBidi" w:hint="eastAsia"/>
+          <w:rFonts w:asciiTheme="minorHAnsi" w:eastAsiaTheme="minorEastAsia" w:hAnsiTheme="minorHAnsi" w:cstheme="minorBidi"/>
           <w:bCs w:val="0"/>
           <w:iCs w:val="0"/>
           <w:sz w:val="22"/>
@@ -6345,7 +6366,7 @@
       <w:pPr>
         <w:pStyle w:val="TOC3"/>
         <w:rPr>
-          <w:rFonts w:asciiTheme="minorHAnsi" w:eastAsiaTheme="minorEastAsia" w:hAnsiTheme="minorHAnsi" w:cstheme="minorBidi" w:hint="eastAsia"/>
+          <w:rFonts w:asciiTheme="minorHAnsi" w:eastAsiaTheme="minorEastAsia" w:hAnsiTheme="minorHAnsi" w:cstheme="minorBidi"/>
           <w:bCs w:val="0"/>
           <w:iCs w:val="0"/>
           <w:sz w:val="22"/>
@@ -6432,7 +6453,7 @@
       <w:pPr>
         <w:pStyle w:val="TOC2"/>
         <w:rPr>
-          <w:rFonts w:asciiTheme="minorHAnsi" w:eastAsiaTheme="minorEastAsia" w:hAnsiTheme="minorHAnsi" w:cstheme="minorBidi" w:hint="eastAsia"/>
+          <w:rFonts w:asciiTheme="minorHAnsi" w:eastAsiaTheme="minorEastAsia" w:hAnsiTheme="minorHAnsi" w:cstheme="minorBidi"/>
           <w:smallCaps w:val="0"/>
           <w:noProof/>
           <w:sz w:val="22"/>
@@ -6529,7 +6550,7 @@
       <w:pPr>
         <w:pStyle w:val="TOC3"/>
         <w:rPr>
-          <w:rFonts w:asciiTheme="minorHAnsi" w:eastAsiaTheme="minorEastAsia" w:hAnsiTheme="minorHAnsi" w:cstheme="minorBidi" w:hint="eastAsia"/>
+          <w:rFonts w:asciiTheme="minorHAnsi" w:eastAsiaTheme="minorEastAsia" w:hAnsiTheme="minorHAnsi" w:cstheme="minorBidi"/>
           <w:bCs w:val="0"/>
           <w:iCs w:val="0"/>
           <w:sz w:val="22"/>
@@ -6616,7 +6637,7 @@
       <w:pPr>
         <w:pStyle w:val="TOC3"/>
         <w:rPr>
-          <w:rFonts w:asciiTheme="minorHAnsi" w:eastAsiaTheme="minorEastAsia" w:hAnsiTheme="minorHAnsi" w:cstheme="minorBidi" w:hint="eastAsia"/>
+          <w:rFonts w:asciiTheme="minorHAnsi" w:eastAsiaTheme="minorEastAsia" w:hAnsiTheme="minorHAnsi" w:cstheme="minorBidi"/>
           <w:bCs w:val="0"/>
           <w:iCs w:val="0"/>
           <w:sz w:val="22"/>
@@ -6703,7 +6724,7 @@
       <w:pPr>
         <w:pStyle w:val="TOC2"/>
         <w:rPr>
-          <w:rFonts w:asciiTheme="minorHAnsi" w:eastAsiaTheme="minorEastAsia" w:hAnsiTheme="minorHAnsi" w:cstheme="minorBidi" w:hint="eastAsia"/>
+          <w:rFonts w:asciiTheme="minorHAnsi" w:eastAsiaTheme="minorEastAsia" w:hAnsiTheme="minorHAnsi" w:cstheme="minorBidi"/>
           <w:smallCaps w:val="0"/>
           <w:noProof/>
           <w:sz w:val="22"/>
@@ -6800,7 +6821,7 @@
       <w:pPr>
         <w:pStyle w:val="TOC1"/>
         <w:rPr>
-          <w:rFonts w:asciiTheme="minorHAnsi" w:eastAsiaTheme="minorEastAsia" w:hAnsiTheme="minorHAnsi" w:cstheme="minorBidi" w:hint="eastAsia"/>
+          <w:rFonts w:asciiTheme="minorHAnsi" w:eastAsiaTheme="minorEastAsia" w:hAnsiTheme="minorHAnsi" w:cstheme="minorBidi"/>
           <w:bCs w:val="0"/>
           <w:caps w:val="0"/>
           <w:noProof/>
@@ -6920,7 +6941,7 @@
       <w:pPr>
         <w:pStyle w:val="TOC2"/>
         <w:rPr>
-          <w:rFonts w:asciiTheme="minorHAnsi" w:eastAsiaTheme="minorEastAsia" w:hAnsiTheme="minorHAnsi" w:cstheme="minorBidi" w:hint="eastAsia"/>
+          <w:rFonts w:asciiTheme="minorHAnsi" w:eastAsiaTheme="minorEastAsia" w:hAnsiTheme="minorHAnsi" w:cstheme="minorBidi"/>
           <w:smallCaps w:val="0"/>
           <w:noProof/>
           <w:sz w:val="22"/>
@@ -7017,7 +7038,7 @@
       <w:pPr>
         <w:pStyle w:val="TOC2"/>
         <w:rPr>
-          <w:rFonts w:asciiTheme="minorHAnsi" w:eastAsiaTheme="minorEastAsia" w:hAnsiTheme="minorHAnsi" w:cstheme="minorBidi" w:hint="eastAsia"/>
+          <w:rFonts w:asciiTheme="minorHAnsi" w:eastAsiaTheme="minorEastAsia" w:hAnsiTheme="minorHAnsi" w:cstheme="minorBidi"/>
           <w:smallCaps w:val="0"/>
           <w:noProof/>
           <w:sz w:val="22"/>
@@ -7114,7 +7135,7 @@
       <w:pPr>
         <w:pStyle w:val="TOC2"/>
         <w:rPr>
-          <w:rFonts w:asciiTheme="minorHAnsi" w:eastAsiaTheme="minorEastAsia" w:hAnsiTheme="minorHAnsi" w:cstheme="minorBidi" w:hint="eastAsia"/>
+          <w:rFonts w:asciiTheme="minorHAnsi" w:eastAsiaTheme="minorEastAsia" w:hAnsiTheme="minorHAnsi" w:cstheme="minorBidi"/>
           <w:smallCaps w:val="0"/>
           <w:noProof/>
           <w:sz w:val="22"/>
@@ -7211,7 +7232,7 @@
       <w:pPr>
         <w:pStyle w:val="TOC1"/>
         <w:rPr>
-          <w:rFonts w:asciiTheme="minorHAnsi" w:eastAsiaTheme="minorEastAsia" w:hAnsiTheme="minorHAnsi" w:cstheme="minorBidi" w:hint="eastAsia"/>
+          <w:rFonts w:asciiTheme="minorHAnsi" w:eastAsiaTheme="minorEastAsia" w:hAnsiTheme="minorHAnsi" w:cstheme="minorBidi"/>
           <w:bCs w:val="0"/>
           <w:caps w:val="0"/>
           <w:noProof/>
@@ -7345,7 +7366,7 @@
       <w:pPr>
         <w:pStyle w:val="TOC1"/>
         <w:rPr>
-          <w:rFonts w:asciiTheme="minorHAnsi" w:eastAsiaTheme="minorEastAsia" w:hAnsiTheme="minorHAnsi" w:cstheme="minorBidi" w:hint="eastAsia"/>
+          <w:rFonts w:asciiTheme="minorHAnsi" w:eastAsiaTheme="minorEastAsia" w:hAnsiTheme="minorHAnsi" w:cstheme="minorBidi"/>
           <w:bCs w:val="0"/>
           <w:caps w:val="0"/>
           <w:noProof/>
@@ -7451,7 +7472,7 @@
       <w:pPr>
         <w:pStyle w:val="TOC1"/>
         <w:rPr>
-          <w:rFonts w:asciiTheme="minorHAnsi" w:eastAsiaTheme="minorEastAsia" w:hAnsiTheme="minorHAnsi" w:cstheme="minorBidi" w:hint="eastAsia"/>
+          <w:rFonts w:asciiTheme="minorHAnsi" w:eastAsiaTheme="minorEastAsia" w:hAnsiTheme="minorHAnsi" w:cstheme="minorBidi"/>
           <w:bCs w:val="0"/>
           <w:caps w:val="0"/>
           <w:noProof/>
@@ -7557,7 +7578,7 @@
       <w:pPr>
         <w:pStyle w:val="TOC1"/>
         <w:rPr>
-          <w:rFonts w:asciiTheme="minorHAnsi" w:eastAsiaTheme="minorEastAsia" w:hAnsiTheme="minorHAnsi" w:cstheme="minorBidi" w:hint="eastAsia"/>
+          <w:rFonts w:asciiTheme="minorHAnsi" w:eastAsiaTheme="minorEastAsia" w:hAnsiTheme="minorHAnsi" w:cstheme="minorBidi"/>
           <w:bCs w:val="0"/>
           <w:caps w:val="0"/>
           <w:noProof/>
@@ -8905,11 +8926,9 @@
       <w:r>
         <w:t xml:space="preserve">PBC </w:t>
       </w:r>
-      <w:proofErr w:type="spellStart"/>
-      <w:r>
-        <w:t>labellimg</w:t>
-      </w:r>
-      <w:proofErr w:type="spellEnd"/>
+      <w:r>
+        <w:t>labelling</w:t>
+      </w:r>
       <w:r>
         <w:t>）</w:t>
       </w:r>
@@ -8978,11 +8997,9 @@
       <w:r>
         <w:t xml:space="preserve">PBC </w:t>
       </w:r>
-      <w:proofErr w:type="spellStart"/>
-      <w:r>
-        <w:t>labellimg</w:t>
-      </w:r>
-      <w:proofErr w:type="spellEnd"/>
+      <w:r>
+        <w:t>labelling</w:t>
+      </w:r>
       <w:r>
         <w:t xml:space="preserve"> Extended</w:t>
       </w:r>
@@ -9335,7 +9352,13 @@
         <w:t>集</w:t>
       </w:r>
       <w:r>
-        <w:t>PBC labellimg Extended</w:t>
+        <w:t xml:space="preserve">PBC </w:t>
+      </w:r>
+      <w:r>
+        <w:t>labelling</w:t>
+      </w:r>
+      <w:r>
+        <w:t xml:space="preserve"> Extended</w:t>
       </w:r>
     </w:p>
     <w:p>
@@ -18774,7 +18797,7 @@
           <w:noProof/>
         </w:rPr>
         <w:drawing>
-          <wp:inline distT="0" distB="0" distL="0" distR="0" wp14:anchorId="2BD1861E" wp14:editId="6EEA9B5B">
+          <wp:inline distT="0" distB="0" distL="0" distR="0" wp14:anchorId="2BD1861E" wp14:editId="6A20F0E1">
             <wp:extent cx="5090795" cy="5090795"/>
             <wp:effectExtent l="0" t="0" r="0" b="0"/>
             <wp:docPr id="1333827093" name="图片 9"/>
@@ -21030,7 +21053,19 @@
         <w:rPr>
           <w:rFonts w:hint="eastAsia"/>
         </w:rPr>
-        <w:t>PBC labeling</w:t>
+        <w:t>PBC label</w:t>
+      </w:r>
+      <w:r>
+        <w:rPr>
+          <w:rFonts w:hint="eastAsia"/>
+        </w:rPr>
+        <w:t>l</w:t>
+      </w:r>
+      <w:r>
+        <w:rPr>
+          <w:rFonts w:hint="eastAsia"/>
+        </w:rPr>
+        <w:t>ing</w:t>
       </w:r>
       <w:r>
         <w:rPr>
@@ -21719,7 +21754,7 @@
       </w:pPr>
       <w:r>
         <w:drawing>
-          <wp:inline distT="0" distB="0" distL="0" distR="0" wp14:anchorId="08CE3D19" wp14:editId="340640A4">
+          <wp:inline distT="0" distB="0" distL="0" distR="0" wp14:anchorId="08CE3D19" wp14:editId="6D1F7037">
             <wp:extent cx="5090795" cy="5090795"/>
             <wp:effectExtent l="0" t="0" r="0" b="0"/>
             <wp:docPr id="864425725" name="图片 11"/>
@@ -26246,7 +26281,16 @@
         <w:t>类目标细胞和红细胞的识别任务，开展了数据集构建、模型训练与消融实验等工作。在公开数据集</w:t>
       </w:r>
       <w:r>
-        <w:t xml:space="preserve"> PBC labeling </w:t>
+        <w:t xml:space="preserve"> PBC labe</w:t>
+      </w:r>
+      <w:r>
+        <w:rPr>
+          <w:rFonts w:hint="eastAsia"/>
+        </w:rPr>
+        <w:t>l</w:t>
+      </w:r>
+      <w:r>
+        <w:t xml:space="preserve">ling </w:t>
       </w:r>
       <w:r>
         <w:t>的基础上，补充红细胞标注并进行数据清洗，构建了增强</w:t>
@@ -32064,7 +32108,16 @@
         <w:t>在公开数据集</w:t>
       </w:r>
       <w:r>
-        <w:t>PBC labeling</w:t>
+        <w:t>PBC label</w:t>
+      </w:r>
+      <w:r>
+        <w:rPr>
+          <w:rFonts w:hint="eastAsia"/>
+        </w:rPr>
+        <w:t>l</w:t>
+      </w:r>
+      <w:r>
+        <w:t>ing</w:t>
       </w:r>
       <w:r>
         <w:t>的基础上，补充标注红细胞并进行数据清洗，构建了增强</w:t>
@@ -40852,7 +40905,7 @@
       <mc:AlternateContent>
         <mc:Choice Requires="wps">
           <w:drawing>
-            <wp:anchor distT="0" distB="0" distL="114300" distR="114300" simplePos="0" relativeHeight="251657216" behindDoc="0" locked="0" layoutInCell="1" allowOverlap="1" wp14:anchorId="2DB3A7BE" wp14:editId="0ACDF06E">
+            <wp:anchor distT="0" distB="0" distL="114300" distR="114300" simplePos="0" relativeHeight="251656192" behindDoc="0" locked="0" layoutInCell="1" allowOverlap="1" wp14:anchorId="2DB3A7BE" wp14:editId="0ACDF06E">
               <wp:simplePos x="0" y="0"/>
               <wp:positionH relativeFrom="margin">
                 <wp:align>center</wp:align>
@@ -40935,7 +40988,7 @@
               <v:stroke joinstyle="miter"/>
               <v:path gradientshapeok="t" o:connecttype="rect"/>
             </v:shapetype>
-            <v:shape id="文本框 3" o:spid="_x0000_s1026" type="#_x0000_t202" style="position:absolute;left:0;text-align:left;margin-left:0;margin-top:0;width:2in;height:2in;z-index:251657216;visibility:visible;mso-wrap-style:none;mso-wrap-distance-left:9pt;mso-wrap-distance-top:0;mso-wrap-distance-right:9pt;mso-wrap-distance-bottom:0;mso-position-horizontal:center;mso-position-horizontal-relative:margin;mso-position-vertical:absolute;mso-position-vertical-relative:text;v-text-anchor:top" o:gfxdata="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" filled="f" stroked="f" strokeweight=".5pt">
+            <v:shape id="文本框 3" o:spid="_x0000_s1026" type="#_x0000_t202" style="position:absolute;left:0;text-align:left;margin-left:0;margin-top:0;width:2in;height:2in;z-index:251656192;visibility:visible;mso-wrap-style:none;mso-wrap-distance-left:9pt;mso-wrap-distance-top:0;mso-wrap-distance-right:9pt;mso-wrap-distance-bottom:0;mso-position-horizontal:center;mso-position-horizontal-relative:margin;mso-position-vertical:absolute;mso-position-vertical-relative:text;v-text-anchor:top" o:gfxdata="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" filled="f" stroked="f" strokeweight=".5pt">
               <v:textbox style="mso-fit-shape-to-text:t" inset="0,0,0,0">
                 <w:txbxContent>
                   <w:p>
@@ -41007,7 +41060,7 @@
       <mc:AlternateContent>
         <mc:Choice Requires="wps">
           <w:drawing>
-            <wp:anchor distT="0" distB="0" distL="114300" distR="114300" simplePos="0" relativeHeight="251659264" behindDoc="0" locked="0" layoutInCell="1" allowOverlap="1" wp14:anchorId="3EE5A706" wp14:editId="62DA7798">
+            <wp:anchor distT="0" distB="0" distL="114300" distR="114300" simplePos="0" relativeHeight="251658240" behindDoc="0" locked="0" layoutInCell="1" allowOverlap="1" wp14:anchorId="3EE5A706" wp14:editId="62DA7798">
               <wp:simplePos x="0" y="0"/>
               <wp:positionH relativeFrom="margin">
                 <wp:align>center</wp:align>
@@ -41071,7 +41124,7 @@
               <v:stroke joinstyle="miter"/>
               <v:path gradientshapeok="t" o:connecttype="rect"/>
             </v:shapetype>
-            <v:shape id="文本框 1828856099" o:spid="_x0000_s1027" type="#_x0000_t202" style="position:absolute;left:0;text-align:left;margin-left:0;margin-top:0;width:2in;height:2in;z-index:251659264;visibility:visible;mso-wrap-style:none;mso-wrap-distance-left:9pt;mso-wrap-distance-top:0;mso-wrap-distance-right:9pt;mso-wrap-distance-bottom:0;mso-position-horizontal:center;mso-position-horizontal-relative:margin;mso-position-vertical:absolute;mso-position-vertical-relative:text;v-text-anchor:top" o:gfxdata="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" filled="f" stroked="f" strokeweight=".5pt">
+            <v:shape id="文本框 1828856099" o:spid="_x0000_s1027" type="#_x0000_t202" style="position:absolute;left:0;text-align:left;margin-left:0;margin-top:0;width:2in;height:2in;z-index:251658240;visibility:visible;mso-wrap-style:none;mso-wrap-distance-left:9pt;mso-wrap-distance-top:0;mso-wrap-distance-right:9pt;mso-wrap-distance-bottom:0;mso-position-horizontal:center;mso-position-horizontal-relative:margin;mso-position-vertical:absolute;mso-position-vertical-relative:text;v-text-anchor:top" o:gfxdata="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" filled="f" stroked="f" strokeweight=".5pt">
               <v:textbox style="mso-fit-shape-to-text:t" inset="0,0,0,0">
                 <w:txbxContent>
                   <w:p/>
@@ -46948,10 +47001,6 @@
 </file>
 
 <file path=customXml/item1.xml><?xml version="1.0" encoding="utf-8"?>
-<b:Sources xmlns:b="http://schemas.openxmlformats.org/officeDocument/2006/bibliography" xmlns="http://schemas.openxmlformats.org/officeDocument/2006/bibliography" SelectedStyle="\ISO690Nmerical.XSL" StyleName="ISO 690 - Numerical Reference"/>
-</file>
-
-<file path=customXml/item2.xml><?xml version="1.0" encoding="utf-8"?>
 <s:customData xmlns="http://www.wps.cn/officeDocument/2013/wpsCustomData" xmlns:s="http://www.wps.cn/officeDocument/2013/wpsCustomData">
   <customSectProps>
     <customSectPr/>
@@ -46971,18 +47020,22 @@
 </s:customData>
 </file>
 
+<file path=customXml/item2.xml><?xml version="1.0" encoding="utf-8"?>
+<b:Sources xmlns:b="http://schemas.openxmlformats.org/officeDocument/2006/bibliography" xmlns="http://schemas.openxmlformats.org/officeDocument/2006/bibliography" SelectedStyle="\ISO690Nmerical.XSL" StyleName="ISO 690 - Numerical Reference"/>
+</file>
+
 <file path=customXml/itemProps1.xml><?xml version="1.0" encoding="utf-8"?>
+<ds:datastoreItem xmlns:ds="http://schemas.openxmlformats.org/officeDocument/2006/customXml" ds:itemID="{B1977F7D-205B-4081-913C-38D41E755F92}">
+  <ds:schemaRefs>
+    <ds:schemaRef ds:uri="http://www.wps.cn/officeDocument/2013/wpsCustomData"/>
+  </ds:schemaRefs>
+</ds:datastoreItem>
+</file>
+
+<file path=customXml/itemProps2.xml><?xml version="1.0" encoding="utf-8"?>
 <ds:datastoreItem xmlns:ds="http://schemas.openxmlformats.org/officeDocument/2006/customXml" ds:itemID="{BEDCA95C-3D48-410E-AD92-042D1EA73267}">
   <ds:schemaRefs>
     <ds:schemaRef ds:uri="http://schemas.openxmlformats.org/officeDocument/2006/bibliography"/>
   </ds:schemaRefs>
 </ds:datastoreItem>
-</file>
-
-<file path=customXml/itemProps2.xml><?xml version="1.0" encoding="utf-8"?>
-<ds:datastoreItem xmlns:ds="http://schemas.openxmlformats.org/officeDocument/2006/customXml" ds:itemID="{B1977F7D-205B-4081-913C-38D41E755F92}">
-  <ds:schemaRefs>
-    <ds:schemaRef ds:uri="http://www.wps.cn/officeDocument/2013/wpsCustomData"/>
-  </ds:schemaRefs>
-</ds:datastoreItem>
 </file>
</xml_diff>